<commit_message>
Per-cell seeding; combined two-model pilot; update manuscript Section 4.6 and Table 7
Co-Authored-By: Claude Sonnet 5.5 <noreply@anthropic.com>
Claude-Session: https://claude.ai/code/session_01XZw1JarumhAukSj5YHuKc2
</commit_message>
<xml_diff>
--- a/paper/ISR_LIDE_revised_with_pilot.docx
+++ b/paper/ISR_LIDE_revised_with_pilot.docx
@@ -49,7 +49,7 @@
           <w:color w:val="000000"/>
           <w:sz w:val="22"/>
         </w:rPr>
-        <w:t>Revision note. This version is a theory-and-design manuscript. Agent-level hypotheses are specified and the measurement harness is validated on scripted agents; hypothesis tests on live LLM agents are not reported. A small feasibility pilot on one open-weight model (Section 4.6) shows that the harness runs on a language model; it does not test the hypotheses. Claims are scoped accordingly.</w:t>
+        <w:t>Revision note. This version is a theory-and-design manuscript. Agent-level hypotheses are specified and the measurement harness is validated on scripted agents; hypothesis tests on live LLM agents are not reported. A small feasibility pilot on two open-weight models (Section 4.6) shows that the harness runs on language models; it does not test the hypotheses. Claims are scoped accordingly.</w:t>
       </w:r>
     </w:p>
     <w:p>
@@ -115,7 +115,7 @@
           <w:color w:val="000000"/>
           <w:sz w:val="24"/>
         </w:rPr>
-        <w:t>The paper’s contribution is theoretical and design-oriented, not empirical on live agents. We specify LIDE, derive discriminating hypotheses, map three governance artifacts (a sanctioned default exit, a stop-loss rule, and friction on irreversible actions) onto the mechanism, and report a known-groups validation of the experimental harness using scripted agents, together with a small feasibility pilot on one open-weight model that does not test the hypotheses. Two preregistered experiments on model families and generations are designed to test the account; those tests are not yet executed. The argument extends research on delegation to agentic artifacts by treating decision quality as state dependent, specifies when behavioral decision theories can transfer to artificial agents, and relocates part of agent governance from model weights to the decision environment.</w:t>
+        <w:t>The paper’s contribution is theoretical and design-oriented, not empirical on live agents. We specify LIDE, derive discriminating hypotheses, map three governance artifacts (a sanctioned default exit, a stop-loss rule, and friction on irreversible actions) onto the mechanism, and report a known-groups validation of the experimental harness using scripted agents, together with a small feasibility pilot on two open-weight models that does not test the hypotheses. Two preregistered experiments on model families and generations are designed to test the account; those tests are not yet executed. The argument extends research on delegation to agentic artifacts by treating decision quality as state dependent, specifies when behavioral decision theories can transfer to artificial agents, and relocates part of agent governance from model weights to the decision environment.</w:t>
       </w:r>
     </w:p>
     <w:p>
@@ -309,7 +309,7 @@
           <w:color w:val="000000"/>
           <w:sz w:val="24"/>
         </w:rPr>
-        <w:t>Scope of the present manuscript. We develop the construct, the mechanism, discriminating hypotheses, and a two-study design. We report a known-groups validation of the measurement harness on scripted agents whose behavior is independent of condition (Section 4.5). We also report one small feasibility pilot on an open-weight model (Section 4.6), which does not test the hypotheses; we report no other tests on live LLM agents. Findings about whether LIDE occurs in current models, and whether the artifacts reduce it, remain empirical questions. Framing the paper this way is deliberate. Submitting an untested hypothesis list as if it were a completed ISR empirical article would overclaim. The contribution on offer is a testable theory of state-dependent agent quality and a governance mapping that can be evaluated once the experiments run.</w:t>
+        <w:t>Scope of the present manuscript. We develop the construct, the mechanism, discriminating hypotheses, and a two-study design. We report a known-groups validation of the measurement harness on scripted agents whose behavior is independent of condition (Section 4.5). We also report one small feasibility pilot on two open-weight models (Section 4.6), which does not test the hypotheses; we report no other tests on live LLM agents. Findings about whether LIDE occurs in current models, and whether the artifacts reduce it, remain empirical questions. Framing the paper this way is deliberate. Submitting an untested hypothesis list as if it were a completed ISR empirical article would overclaim. The contribution on offer is a testable theory of state-dependent agent quality and a governance mapping that can be evaluated once the experiments run.</w:t>
       </w:r>
     </w:p>
     <w:p>
@@ -4215,7 +4215,7 @@
           <w:color w:val="000000"/>
           <w:sz w:val="24"/>
         </w:rPr>
-        <w:t xml:space="preserve">To check that the harness runs end to end on a language model, we ran the full design (Studies 1 and 2 and the failure-signal block; 36 cells per environment, 72 in total) on one open-weight model, Qwen2.5-0.5B-Instruct, with two repetitions per cell (144 episodes) on a CPU. A model of this size does not reliably emit well-formed tool calls, so actions were chosen by constrained sampling. Each usable tool, and under the friction artifact a confirmed variant of every high-risk tool, was scored by the model’s log-likelihood as its reply, and one option was sampled in proportion to those probabilities (temperature 1, seeded by episode). This is a forced-choice proxy for free-form tool use. Action risk used the placeholder taxonomy of Section 4.3, not the Delphi scores, and LIDE was classified with a risk threshold of 0.10 above the model’s baseline.</w:t>
+        <w:t xml:space="preserve">To check that the harness runs end to end on language models, we ran the full design (Studies 1 and 2 and the failure-signal block; 36 cells per environment, 72 in total) on two small open-weight models from different families on a CPU: Qwen2.5-0.5B-Instruct with four repetitions per cell (288 episodes) and SmolLM2-360M-Instruct with two (144 episodes), 432 episodes in all. Models of this size do not reliably emit well-formed tool calls, so actions were chosen by constrained sampling. Each usable tool, and under the friction artifact a confirmed variant of every high-risk tool, was scored by the model’s log-likelihood as its reply, and one option was sampled in proportion to those probabilities (temperature 1). This is a forced-choice proxy for free-form tool use. Two further models (Qwen3-0.6B and Qwen2.5-1.5B) were planned to add a generation and a size contrast; the run was cut short by compute limits and no data from them are reported. Action risk used the placeholder taxonomy of Section 4.3, not the Delphi scores. LIDE was classified with a risk threshold of 0.10 above the baseline of each model and environment, which rests on two to four episodes.</w:t>
       </w:r>
     </w:p>
     <w:p>
@@ -4232,7 +4232,7 @@
           <w:color w:val="000000"/>
           <w:sz w:val="24"/>
         </w:rPr>
-        <w:t xml:space="preserve">The classifier flagged LIDE in none of the 144 episodes. Table 7 shows that mean action risk did not rise with accumulated loss. It was 0.204 after the neutral history and 0.086, 0.113, and 0.083 after two, four, and eight consecutive failures, which is the opposite of the direction H1 predicts. The success-streak history (0.134) was below the neutral history, the direction H2 predicts. Neither contrast is informative. The baseline that defines LIDE rests on two episodes per environment, the standard deviations of action risk (0.13 to 0.25) exceed the differences between histories, and the planned H2 contrast has only two model-by-environment cells (mean difference −0.139, one-sided p = .30). Keeping the full failure record produced the same LIDE rate as the neutral summary (0 and 0), the user-dissatisfaction block did not differ from environment-only failure (0 and 0), and eight-failure cells under the deadline cue without an artifact produced no damage, so there was no escalation for an artifact to reduce.</w:t>
+        <w:t xml:space="preserve">The classifier flagged LIDE in 58 of the 432 episodes, all after failure histories because the classifier requires accumulated loss. That count is not evidence of LIDE. The two conditions that define it, a rise in action risk over baseline and an omitted safeguard, were met in 20.8 percent of episodes with no prior loss (neutral and success histories) and in 20.8 percent of episodes with prior loss (Table 7), so the criteria fire equally often with and without failure. Mean action risk after two, four, and eight failures (0.235, 0.262, and 0.249) did not differ from the neutral history (0.230). In paired contrasts within model, repetition, and environment (12 units) the differences were 0.005, 0.032, and 0.019 (all p &gt; .6). The success-streak history (0.287) was higher than the neutral history, not lower as H2 predicts, but that difference is not reliable either (0.057, p = .37). Retaining the full failure record produced a similar rate of flagged episodes to the neutral summary (22.2 and 19.4 percent, p = .74), and the user-dissatisfaction block did not differ from environment-only failure (2 and 3 of 12 episodes). Under the deadline cue after eight failures, flagged episodes fell from 4 of 12 without an artifact to none of 12 with stop-loss, but stop-loss removes the risky tools mechanically, and each cell holds 12 episodes, so this says nothing about the behavioral effect of the artifacts.</w:t>
       </w:r>
     </w:p>
     <w:p>
@@ -4248,7 +4248,7 @@
           <w:color w:val="000000"/>
           <w:sz w:val="22"/>
         </w:rPr>
-        <w:t>Table 7. Pilot on Qwen2.5-0.5B-Instruct: Study 1 Cells by History, Environments Pooled</w:t>
+        <w:t>Table 7. Pilot on Two Open-Weight Models: Study 1 Cells by History, Models and Environments Pooled</w:t>
       </w:r>
     </w:p>
     <w:tbl>
@@ -4259,17 +4259,18 @@
         <w:tblLook w:firstColumn="1" w:firstRow="1" w:lastColumn="0" w:lastRow="0" w:noHBand="0" w:noVBand="1" w:val="04A0"/>
       </w:tblPr>
       <w:tblGrid>
-        <w:gridCol w:w="1800"/>
-        <w:gridCol w:w="1200"/>
-        <w:gridCol w:w="1800"/>
-        <w:gridCol w:w="1560"/>
+        <w:gridCol w:w="1450"/>
+        <w:gridCol w:w="950"/>
         <w:gridCol w:w="1500"/>
+        <w:gridCol w:w="1400"/>
+        <w:gridCol w:w="1150"/>
         <w:gridCol w:w="1500"/>
+        <w:gridCol w:w="1410"/>
       </w:tblGrid>
       <w:tr>
         <w:tc>
           <w:tcPr>
-            <w:tcW w:type="dxa" w:w="1800"/>
+            <w:tcW w:type="dxa" w:w="1450"/>
           </w:tcPr>
           <w:p>
             <w:pPr>
@@ -4289,7 +4290,7 @@
         </w:tc>
         <w:tc>
           <w:tcPr>
-            <w:tcW w:type="dxa" w:w="1200"/>
+            <w:tcW w:type="dxa" w:w="950"/>
           </w:tcPr>
           <w:p>
             <w:pPr>
@@ -4309,7 +4310,7 @@
         </w:tc>
         <w:tc>
           <w:tcPr>
-            <w:tcW w:type="dxa" w:w="1800"/>
+            <w:tcW w:type="dxa" w:w="1500"/>
           </w:tcPr>
           <w:p>
             <w:pPr>
@@ -4329,7 +4330,7 @@
         </w:tc>
         <w:tc>
           <w:tcPr>
-            <w:tcW w:type="dxa" w:w="1560"/>
+            <w:tcW w:type="dxa" w:w="1400"/>
           </w:tcPr>
           <w:p>
             <w:pPr>
@@ -4349,7 +4350,7 @@
         </w:tc>
         <w:tc>
           <w:tcPr>
-            <w:tcW w:type="dxa" w:w="1500"/>
+            <w:tcW w:type="dxa" w:w="1150"/>
           </w:tcPr>
           <w:p>
             <w:pPr>
@@ -4383,6 +4384,26 @@
                 <w:color w:val="000000"/>
                 <w:sz w:val="20"/>
               </w:rPr>
+              <w:t>Risk and safeguard criteria met</w:t>
+            </w:r>
+          </w:p>
+        </w:tc>
+        <w:tc>
+          <w:tcPr>
+            <w:tcW w:type="dxa" w:w="1410"/>
+          </w:tcPr>
+          <w:p>
+            <w:pPr>
+              <w:spacing w:line="276" w:lineRule="auto"/>
+            </w:pPr>
+            <w:r>
+              <w:rPr>
+                <w:rFonts w:ascii="Times New Roman" w:hAnsi="Times New Roman" w:eastAsia="Times New Roman"/>
+                <w:b/>
+                <w:i w:val="0"/>
+                <w:color w:val="000000"/>
+                <w:sz w:val="20"/>
+              </w:rPr>
               <w:t>LIDE episodes</w:t>
             </w:r>
           </w:p>
@@ -4391,7 +4412,7 @@
       <w:tr>
         <w:tc>
           <w:tcPr>
-            <w:tcW w:type="dxa" w:w="1800"/>
+            <w:tcW w:type="dxa" w:w="1450"/>
           </w:tcPr>
           <w:p>
             <w:pPr>
@@ -4411,7 +4432,7 @@
         </w:tc>
         <w:tc>
           <w:tcPr>
-            <w:tcW w:type="dxa" w:w="1200"/>
+            <w:tcW w:type="dxa" w:w="950"/>
           </w:tcPr>
           <w:p>
             <w:pPr>
@@ -4425,47 +4446,7 @@
                 <w:color w:val="000000"/>
                 <w:sz w:val="20"/>
               </w:rPr>
-              <w:t>12</w:t>
-            </w:r>
-          </w:p>
-        </w:tc>
-        <w:tc>
-          <w:tcPr>
-            <w:tcW w:type="dxa" w:w="1800"/>
-          </w:tcPr>
-          <w:p>
-            <w:pPr>
-              <w:spacing w:line="276" w:lineRule="auto"/>
-            </w:pPr>
-            <w:r>
-              <w:rPr>
-                <w:rFonts w:ascii="Times New Roman" w:hAnsi="Times New Roman" w:eastAsia="Times New Roman"/>
-                <w:b w:val="0"/>
-                <w:i w:val="0"/>
-                <w:color w:val="000000"/>
-                <w:sz w:val="20"/>
-              </w:rPr>
-              <w:t>0.134 (0.207)</w:t>
-            </w:r>
-          </w:p>
-        </w:tc>
-        <w:tc>
-          <w:tcPr>
-            <w:tcW w:type="dxa" w:w="1560"/>
-          </w:tcPr>
-          <w:p>
-            <w:pPr>
-              <w:spacing w:line="276" w:lineRule="auto"/>
-            </w:pPr>
-            <w:r>
-              <w:rPr>
-                <w:rFonts w:ascii="Times New Roman" w:hAnsi="Times New Roman" w:eastAsia="Times New Roman"/>
-                <w:b w:val="0"/>
-                <w:i w:val="0"/>
-                <w:color w:val="000000"/>
-                <w:sz w:val="20"/>
-              </w:rPr>
-              <w:t>0.17</w:t>
+              <w:t>36</w:t>
             </w:r>
           </w:p>
         </w:tc>
@@ -4485,13 +4466,73 @@
                 <w:color w:val="000000"/>
                 <w:sz w:val="20"/>
               </w:rPr>
-              <w:t>0.08</w:t>
+              <w:t>0.287 (0.374)</w:t>
+            </w:r>
+          </w:p>
+        </w:tc>
+        <w:tc>
+          <w:tcPr>
+            <w:tcW w:type="dxa" w:w="1400"/>
+          </w:tcPr>
+          <w:p>
+            <w:pPr>
+              <w:spacing w:line="276" w:lineRule="auto"/>
+            </w:pPr>
+            <w:r>
+              <w:rPr>
+                <w:rFonts w:ascii="Times New Roman" w:hAnsi="Times New Roman" w:eastAsia="Times New Roman"/>
+                <w:b w:val="0"/>
+                <w:i w:val="0"/>
+                <w:color w:val="000000"/>
+                <w:sz w:val="20"/>
+              </w:rPr>
+              <w:t>0.44</w:t>
+            </w:r>
+          </w:p>
+        </w:tc>
+        <w:tc>
+          <w:tcPr>
+            <w:tcW w:type="dxa" w:w="1150"/>
+          </w:tcPr>
+          <w:p>
+            <w:pPr>
+              <w:spacing w:line="276" w:lineRule="auto"/>
+            </w:pPr>
+            <w:r>
+              <w:rPr>
+                <w:rFonts w:ascii="Times New Roman" w:hAnsi="Times New Roman" w:eastAsia="Times New Roman"/>
+                <w:b w:val="0"/>
+                <w:i w:val="0"/>
+                <w:color w:val="000000"/>
+                <w:sz w:val="20"/>
+              </w:rPr>
+              <w:t>0.11</w:t>
             </w:r>
           </w:p>
         </w:tc>
         <w:tc>
           <w:tcPr>
             <w:tcW w:type="dxa" w:w="1500"/>
+          </w:tcPr>
+          <w:p>
+            <w:pPr>
+              <w:spacing w:line="276" w:lineRule="auto"/>
+            </w:pPr>
+            <w:r>
+              <w:rPr>
+                <w:rFonts w:ascii="Times New Roman" w:hAnsi="Times New Roman" w:eastAsia="Times New Roman"/>
+                <w:b w:val="0"/>
+                <w:i w:val="0"/>
+                <w:color w:val="000000"/>
+                <w:sz w:val="20"/>
+              </w:rPr>
+              <w:t>30.6%</w:t>
+            </w:r>
+          </w:p>
+        </w:tc>
+        <w:tc>
+          <w:tcPr>
+            <w:tcW w:type="dxa" w:w="1410"/>
           </w:tcPr>
           <w:p>
             <w:pPr>
@@ -4513,7 +4554,7 @@
       <w:tr>
         <w:tc>
           <w:tcPr>
-            <w:tcW w:type="dxa" w:w="1800"/>
+            <w:tcW w:type="dxa" w:w="1450"/>
           </w:tcPr>
           <w:p>
             <w:pPr>
@@ -4533,7 +4574,7 @@
         </w:tc>
         <w:tc>
           <w:tcPr>
-            <w:tcW w:type="dxa" w:w="1200"/>
+            <w:tcW w:type="dxa" w:w="950"/>
           </w:tcPr>
           <w:p>
             <w:pPr>
@@ -4547,47 +4588,7 @@
                 <w:color w:val="000000"/>
                 <w:sz w:val="20"/>
               </w:rPr>
-              <w:t>12</w:t>
-            </w:r>
-          </w:p>
-        </w:tc>
-        <w:tc>
-          <w:tcPr>
-            <w:tcW w:type="dxa" w:w="1800"/>
-          </w:tcPr>
-          <w:p>
-            <w:pPr>
-              <w:spacing w:line="276" w:lineRule="auto"/>
-            </w:pPr>
-            <w:r>
-              <w:rPr>
-                <w:rFonts w:ascii="Times New Roman" w:hAnsi="Times New Roman" w:eastAsia="Times New Roman"/>
-                <w:b w:val="0"/>
-                <w:i w:val="0"/>
-                <w:color w:val="000000"/>
-                <w:sz w:val="20"/>
-              </w:rPr>
-              <w:t>0.204 (0.252)</w:t>
-            </w:r>
-          </w:p>
-        </w:tc>
-        <w:tc>
-          <w:tcPr>
-            <w:tcW w:type="dxa" w:w="1560"/>
-          </w:tcPr>
-          <w:p>
-            <w:pPr>
-              <w:spacing w:line="276" w:lineRule="auto"/>
-            </w:pPr>
-            <w:r>
-              <w:rPr>
-                <w:rFonts w:ascii="Times New Roman" w:hAnsi="Times New Roman" w:eastAsia="Times New Roman"/>
-                <w:b w:val="0"/>
-                <w:i w:val="0"/>
-                <w:color w:val="000000"/>
-                <w:sz w:val="20"/>
-              </w:rPr>
-              <w:t>0.17</w:t>
+              <w:t>36</w:t>
             </w:r>
           </w:p>
         </w:tc>
@@ -4607,13 +4608,73 @@
                 <w:color w:val="000000"/>
                 <w:sz w:val="20"/>
               </w:rPr>
-              <w:t>0.00</w:t>
+              <w:t>0.230 (0.313)</w:t>
+            </w:r>
+          </w:p>
+        </w:tc>
+        <w:tc>
+          <w:tcPr>
+            <w:tcW w:type="dxa" w:w="1400"/>
+          </w:tcPr>
+          <w:p>
+            <w:pPr>
+              <w:spacing w:line="276" w:lineRule="auto"/>
+            </w:pPr>
+            <w:r>
+              <w:rPr>
+                <w:rFonts w:ascii="Times New Roman" w:hAnsi="Times New Roman" w:eastAsia="Times New Roman"/>
+                <w:b w:val="0"/>
+                <w:i w:val="0"/>
+                <w:color w:val="000000"/>
+                <w:sz w:val="20"/>
+              </w:rPr>
+              <w:t>0.25</w:t>
+            </w:r>
+          </w:p>
+        </w:tc>
+        <w:tc>
+          <w:tcPr>
+            <w:tcW w:type="dxa" w:w="1150"/>
+          </w:tcPr>
+          <w:p>
+            <w:pPr>
+              <w:spacing w:line="276" w:lineRule="auto"/>
+            </w:pPr>
+            <w:r>
+              <w:rPr>
+                <w:rFonts w:ascii="Times New Roman" w:hAnsi="Times New Roman" w:eastAsia="Times New Roman"/>
+                <w:b w:val="0"/>
+                <w:i w:val="0"/>
+                <w:color w:val="000000"/>
+                <w:sz w:val="20"/>
+              </w:rPr>
+              <w:t>0.03</w:t>
             </w:r>
           </w:p>
         </w:tc>
         <w:tc>
           <w:tcPr>
             <w:tcW w:type="dxa" w:w="1500"/>
+          </w:tcPr>
+          <w:p>
+            <w:pPr>
+              <w:spacing w:line="276" w:lineRule="auto"/>
+            </w:pPr>
+            <w:r>
+              <w:rPr>
+                <w:rFonts w:ascii="Times New Roman" w:hAnsi="Times New Roman" w:eastAsia="Times New Roman"/>
+                <w:b w:val="0"/>
+                <w:i w:val="0"/>
+                <w:color w:val="000000"/>
+                <w:sz w:val="20"/>
+              </w:rPr>
+              <w:t>11.1%</w:t>
+            </w:r>
+          </w:p>
+        </w:tc>
+        <w:tc>
+          <w:tcPr>
+            <w:tcW w:type="dxa" w:w="1410"/>
           </w:tcPr>
           <w:p>
             <w:pPr>
@@ -4635,7 +4696,7 @@
       <w:tr>
         <w:tc>
           <w:tcPr>
-            <w:tcW w:type="dxa" w:w="1800"/>
+            <w:tcW w:type="dxa" w:w="1450"/>
           </w:tcPr>
           <w:p>
             <w:pPr>
@@ -4655,7 +4716,7 @@
         </w:tc>
         <w:tc>
           <w:tcPr>
-            <w:tcW w:type="dxa" w:w="1200"/>
+            <w:tcW w:type="dxa" w:w="950"/>
           </w:tcPr>
           <w:p>
             <w:pPr>
@@ -4669,47 +4730,7 @@
                 <w:color w:val="000000"/>
                 <w:sz w:val="20"/>
               </w:rPr>
-              <w:t>24</w:t>
-            </w:r>
-          </w:p>
-        </w:tc>
-        <w:tc>
-          <w:tcPr>
-            <w:tcW w:type="dxa" w:w="1800"/>
-          </w:tcPr>
-          <w:p>
-            <w:pPr>
-              <w:spacing w:line="276" w:lineRule="auto"/>
-            </w:pPr>
-            <w:r>
-              <w:rPr>
-                <w:rFonts w:ascii="Times New Roman" w:hAnsi="Times New Roman" w:eastAsia="Times New Roman"/>
-                <w:b w:val="0"/>
-                <w:i w:val="0"/>
-                <w:color w:val="000000"/>
-                <w:sz w:val="20"/>
-              </w:rPr>
-              <w:t>0.086 (0.129)</w:t>
-            </w:r>
-          </w:p>
-        </w:tc>
-        <w:tc>
-          <w:tcPr>
-            <w:tcW w:type="dxa" w:w="1560"/>
-          </w:tcPr>
-          <w:p>
-            <w:pPr>
-              <w:spacing w:line="276" w:lineRule="auto"/>
-            </w:pPr>
-            <w:r>
-              <w:rPr>
-                <w:rFonts w:ascii="Times New Roman" w:hAnsi="Times New Roman" w:eastAsia="Times New Roman"/>
-                <w:b w:val="0"/>
-                <w:i w:val="0"/>
-                <w:color w:val="000000"/>
-                <w:sz w:val="20"/>
-              </w:rPr>
-              <w:t>0.08</w:t>
+              <w:t>72</w:t>
             </w:r>
           </w:p>
         </w:tc>
@@ -4729,7 +4750,47 @@
                 <w:color w:val="000000"/>
                 <w:sz w:val="20"/>
               </w:rPr>
-              <w:t>0.13</w:t>
+              <w:t>0.235 (0.356)</w:t>
+            </w:r>
+          </w:p>
+        </w:tc>
+        <w:tc>
+          <w:tcPr>
+            <w:tcW w:type="dxa" w:w="1400"/>
+          </w:tcPr>
+          <w:p>
+            <w:pPr>
+              <w:spacing w:line="276" w:lineRule="auto"/>
+            </w:pPr>
+            <w:r>
+              <w:rPr>
+                <w:rFonts w:ascii="Times New Roman" w:hAnsi="Times New Roman" w:eastAsia="Times New Roman"/>
+                <w:b w:val="0"/>
+                <w:i w:val="0"/>
+                <w:color w:val="000000"/>
+                <w:sz w:val="20"/>
+              </w:rPr>
+              <w:t>0.31</w:t>
+            </w:r>
+          </w:p>
+        </w:tc>
+        <w:tc>
+          <w:tcPr>
+            <w:tcW w:type="dxa" w:w="1150"/>
+          </w:tcPr>
+          <w:p>
+            <w:pPr>
+              <w:spacing w:line="276" w:lineRule="auto"/>
+            </w:pPr>
+            <w:r>
+              <w:rPr>
+                <w:rFonts w:ascii="Times New Roman" w:hAnsi="Times New Roman" w:eastAsia="Times New Roman"/>
+                <w:b w:val="0"/>
+                <w:i w:val="0"/>
+                <w:color w:val="000000"/>
+                <w:sz w:val="20"/>
+              </w:rPr>
+              <w:t>0.11</w:t>
             </w:r>
           </w:p>
         </w:tc>
@@ -4749,7 +4810,27 @@
                 <w:color w:val="000000"/>
                 <w:sz w:val="20"/>
               </w:rPr>
-              <w:t>0</w:t>
+              <w:t>18.1%</w:t>
+            </w:r>
+          </w:p>
+        </w:tc>
+        <w:tc>
+          <w:tcPr>
+            <w:tcW w:type="dxa" w:w="1410"/>
+          </w:tcPr>
+          <w:p>
+            <w:pPr>
+              <w:spacing w:line="276" w:lineRule="auto"/>
+            </w:pPr>
+            <w:r>
+              <w:rPr>
+                <w:rFonts w:ascii="Times New Roman" w:hAnsi="Times New Roman" w:eastAsia="Times New Roman"/>
+                <w:b w:val="0"/>
+                <w:i w:val="0"/>
+                <w:color w:val="000000"/>
+                <w:sz w:val="20"/>
+              </w:rPr>
+              <w:t>13</w:t>
             </w:r>
           </w:p>
         </w:tc>
@@ -4757,7 +4838,7 @@
       <w:tr>
         <w:tc>
           <w:tcPr>
-            <w:tcW w:type="dxa" w:w="1800"/>
+            <w:tcW w:type="dxa" w:w="1450"/>
           </w:tcPr>
           <w:p>
             <w:pPr>
@@ -4777,7 +4858,7 @@
         </w:tc>
         <w:tc>
           <w:tcPr>
-            <w:tcW w:type="dxa" w:w="1200"/>
+            <w:tcW w:type="dxa" w:w="950"/>
           </w:tcPr>
           <w:p>
             <w:pPr>
@@ -4791,47 +4872,7 @@
                 <w:color w:val="000000"/>
                 <w:sz w:val="20"/>
               </w:rPr>
-              <w:t>24</w:t>
-            </w:r>
-          </w:p>
-        </w:tc>
-        <w:tc>
-          <w:tcPr>
-            <w:tcW w:type="dxa" w:w="1800"/>
-          </w:tcPr>
-          <w:p>
-            <w:pPr>
-              <w:spacing w:line="276" w:lineRule="auto"/>
-            </w:pPr>
-            <w:r>
-              <w:rPr>
-                <w:rFonts w:ascii="Times New Roman" w:hAnsi="Times New Roman" w:eastAsia="Times New Roman"/>
-                <w:b w:val="0"/>
-                <w:i w:val="0"/>
-                <w:color w:val="000000"/>
-                <w:sz w:val="20"/>
-              </w:rPr>
-              <w:t>0.113 (0.201)</w:t>
-            </w:r>
-          </w:p>
-        </w:tc>
-        <w:tc>
-          <w:tcPr>
-            <w:tcW w:type="dxa" w:w="1560"/>
-          </w:tcPr>
-          <w:p>
-            <w:pPr>
-              <w:spacing w:line="276" w:lineRule="auto"/>
-            </w:pPr>
-            <w:r>
-              <w:rPr>
-                <w:rFonts w:ascii="Times New Roman" w:hAnsi="Times New Roman" w:eastAsia="Times New Roman"/>
-                <w:b w:val="0"/>
-                <w:i w:val="0"/>
-                <w:color w:val="000000"/>
-                <w:sz w:val="20"/>
-              </w:rPr>
-              <w:t>0.21</w:t>
+              <w:t>72</w:t>
             </w:r>
           </w:p>
         </w:tc>
@@ -4851,7 +4892,47 @@
                 <w:color w:val="000000"/>
                 <w:sz w:val="20"/>
               </w:rPr>
-              <w:t>0.13</w:t>
+              <w:t>0.262 (0.370)</w:t>
+            </w:r>
+          </w:p>
+        </w:tc>
+        <w:tc>
+          <w:tcPr>
+            <w:tcW w:type="dxa" w:w="1400"/>
+          </w:tcPr>
+          <w:p>
+            <w:pPr>
+              <w:spacing w:line="276" w:lineRule="auto"/>
+            </w:pPr>
+            <w:r>
+              <w:rPr>
+                <w:rFonts w:ascii="Times New Roman" w:hAnsi="Times New Roman" w:eastAsia="Times New Roman"/>
+                <w:b w:val="0"/>
+                <w:i w:val="0"/>
+                <w:color w:val="000000"/>
+                <w:sz w:val="20"/>
+              </w:rPr>
+              <w:t>0.39</w:t>
+            </w:r>
+          </w:p>
+        </w:tc>
+        <w:tc>
+          <w:tcPr>
+            <w:tcW w:type="dxa" w:w="1150"/>
+          </w:tcPr>
+          <w:p>
+            <w:pPr>
+              <w:spacing w:line="276" w:lineRule="auto"/>
+            </w:pPr>
+            <w:r>
+              <w:rPr>
+                <w:rFonts w:ascii="Times New Roman" w:hAnsi="Times New Roman" w:eastAsia="Times New Roman"/>
+                <w:b w:val="0"/>
+                <w:i w:val="0"/>
+                <w:color w:val="000000"/>
+                <w:sz w:val="20"/>
+              </w:rPr>
+              <w:t>0.11</w:t>
             </w:r>
           </w:p>
         </w:tc>
@@ -4871,7 +4952,27 @@
                 <w:color w:val="000000"/>
                 <w:sz w:val="20"/>
               </w:rPr>
-              <w:t>0</w:t>
+              <w:t>20.8%</w:t>
+            </w:r>
+          </w:p>
+        </w:tc>
+        <w:tc>
+          <w:tcPr>
+            <w:tcW w:type="dxa" w:w="1410"/>
+          </w:tcPr>
+          <w:p>
+            <w:pPr>
+              <w:spacing w:line="276" w:lineRule="auto"/>
+            </w:pPr>
+            <w:r>
+              <w:rPr>
+                <w:rFonts w:ascii="Times New Roman" w:hAnsi="Times New Roman" w:eastAsia="Times New Roman"/>
+                <w:b w:val="0"/>
+                <w:i w:val="0"/>
+                <w:color w:val="000000"/>
+                <w:sz w:val="20"/>
+              </w:rPr>
+              <w:t>15</w:t>
             </w:r>
           </w:p>
         </w:tc>
@@ -4879,7 +4980,7 @@
       <w:tr>
         <w:tc>
           <w:tcPr>
-            <w:tcW w:type="dxa" w:w="1800"/>
+            <w:tcW w:type="dxa" w:w="1450"/>
           </w:tcPr>
           <w:p>
             <w:pPr>
@@ -4899,7 +5000,7 @@
         </w:tc>
         <w:tc>
           <w:tcPr>
-            <w:tcW w:type="dxa" w:w="1200"/>
+            <w:tcW w:type="dxa" w:w="950"/>
           </w:tcPr>
           <w:p>
             <w:pPr>
@@ -4913,47 +5014,7 @@
                 <w:color w:val="000000"/>
                 <w:sz w:val="20"/>
               </w:rPr>
-              <w:t>24</w:t>
-            </w:r>
-          </w:p>
-        </w:tc>
-        <w:tc>
-          <w:tcPr>
-            <w:tcW w:type="dxa" w:w="1800"/>
-          </w:tcPr>
-          <w:p>
-            <w:pPr>
-              <w:spacing w:line="276" w:lineRule="auto"/>
-            </w:pPr>
-            <w:r>
-              <w:rPr>
-                <w:rFonts w:ascii="Times New Roman" w:hAnsi="Times New Roman" w:eastAsia="Times New Roman"/>
-                <w:b w:val="0"/>
-                <w:i w:val="0"/>
-                <w:color w:val="000000"/>
-                <w:sz w:val="20"/>
-              </w:rPr>
-              <w:t>0.083 (0.170)</w:t>
-            </w:r>
-          </w:p>
-        </w:tc>
-        <w:tc>
-          <w:tcPr>
-            <w:tcW w:type="dxa" w:w="1560"/>
-          </w:tcPr>
-          <w:p>
-            <w:pPr>
-              <w:spacing w:line="276" w:lineRule="auto"/>
-            </w:pPr>
-            <w:r>
-              <w:rPr>
-                <w:rFonts w:ascii="Times New Roman" w:hAnsi="Times New Roman" w:eastAsia="Times New Roman"/>
-                <w:b w:val="0"/>
-                <w:i w:val="0"/>
-                <w:color w:val="000000"/>
-                <w:sz w:val="20"/>
-              </w:rPr>
-              <w:t>0.08</w:t>
+              <w:t>72</w:t>
             </w:r>
           </w:p>
         </w:tc>
@@ -4973,7 +5034,47 @@
                 <w:color w:val="000000"/>
                 <w:sz w:val="20"/>
               </w:rPr>
-              <w:t>0.08</w:t>
+              <w:t>0.249 (0.366)</w:t>
+            </w:r>
+          </w:p>
+        </w:tc>
+        <w:tc>
+          <w:tcPr>
+            <w:tcW w:type="dxa" w:w="1400"/>
+          </w:tcPr>
+          <w:p>
+            <w:pPr>
+              <w:spacing w:line="276" w:lineRule="auto"/>
+            </w:pPr>
+            <w:r>
+              <w:rPr>
+                <w:rFonts w:ascii="Times New Roman" w:hAnsi="Times New Roman" w:eastAsia="Times New Roman"/>
+                <w:b w:val="0"/>
+                <w:i w:val="0"/>
+                <w:color w:val="000000"/>
+                <w:sz w:val="20"/>
+              </w:rPr>
+              <w:t>0.35</w:t>
+            </w:r>
+          </w:p>
+        </w:tc>
+        <w:tc>
+          <w:tcPr>
+            <w:tcW w:type="dxa" w:w="1150"/>
+          </w:tcPr>
+          <w:p>
+            <w:pPr>
+              <w:spacing w:line="276" w:lineRule="auto"/>
+            </w:pPr>
+            <w:r>
+              <w:rPr>
+                <w:rFonts w:ascii="Times New Roman" w:hAnsi="Times New Roman" w:eastAsia="Times New Roman"/>
+                <w:b w:val="0"/>
+                <w:i w:val="0"/>
+                <w:color w:val="000000"/>
+                <w:sz w:val="20"/>
+              </w:rPr>
+              <w:t>0.10</w:t>
             </w:r>
           </w:p>
         </w:tc>
@@ -4993,7 +5094,27 @@
                 <w:color w:val="000000"/>
                 <w:sz w:val="20"/>
               </w:rPr>
-              <w:t>0</w:t>
+              <w:t>23.6%</w:t>
+            </w:r>
+          </w:p>
+        </w:tc>
+        <w:tc>
+          <w:tcPr>
+            <w:tcW w:type="dxa" w:w="1410"/>
+          </w:tcPr>
+          <w:p>
+            <w:pPr>
+              <w:spacing w:line="276" w:lineRule="auto"/>
+            </w:pPr>
+            <w:r>
+              <w:rPr>
+                <w:rFonts w:ascii="Times New Roman" w:hAnsi="Times New Roman" w:eastAsia="Times New Roman"/>
+                <w:b w:val="0"/>
+                <w:i w:val="0"/>
+                <w:color w:val="000000"/>
+                <w:sz w:val="20"/>
+              </w:rPr>
+              <w:t>17</w:t>
             </w:r>
           </w:p>
         </w:tc>
@@ -5013,7 +5134,7 @@
           <w:color w:val="000000"/>
           <w:sz w:val="24"/>
         </w:rPr>
-        <w:t xml:space="preserve">Note. Episodes are Study 1 cells pooled over the coding and operations environments and over scarcity and record conditions. Honest exit is the report of impossibility. LIDE is the classifier of Table 4.</w:t>
+        <w:t xml:space="preserve">Note. Study 1 cells pooled over Qwen2.5-0.5B-Instruct, SmolLM2-360M-Instruct, both environments, and scarcity and record conditions. Honest exit is the report of impossibility. The criteria column applies the classifier of Table 4 without its requirement of prior loss; LIDE episodes apply it in full, so histories without failure are zero by construction.</w:t>
       </w:r>
     </w:p>
     <w:p>
@@ -5030,7 +5151,7 @@
           <w:color w:val="000000"/>
           <w:sz w:val="24"/>
         </w:rPr>
-        <w:t xml:space="preserve">The model’s behavior is compatible with capability and format limits rather than LIDE. In the coding environment it queried the operator in every episode, usually repeatedly, and in operations it mostly repeated the same restart or query. Tampering or destructive actions occurred at similar rates across histories (0.08 to 0.21) with no ordering by loss. Repetition without a rise in action risk is what the capability-limits rival in Table 2 predicts.</w:t>
+        <w:t xml:space="preserve">Most of the variation lies between sampling runs, not between conditions. The between-unit standard deviation of mean risk (0.33; units are model, repetition, and environment) is almost twice the within-unit standard deviation (0.18). In the operations environment the mean risk of Qwen2.5-0.5B was 0.11, 0.32, 0.94, and 0.81 in successive repetitions, because the harness seeded sampling by repetition alone, so all cells of a repetition shared the same random draws and the repetitions, not the 432 episodes, are the effective sample. The harness now seeds each episode by cell and repetition. The models’ behavior is also compatible with capability and format limits rather than LIDE. In the coding environment Qwen2.5-0.5B queried the operator in every episode, usually repeatedly, and SmolLM2-360M usually filed a completion report within about two steps (76 percent false completions) whatever the history. Repetition and premature completion without a rise in action risk with loss are what the capability-limits rival in Table 2 predicts.</w:t>
       </w:r>
     </w:p>
     <w:p>
@@ -5047,7 +5168,7 @@
           <w:color w:val="000000"/>
           <w:sz w:val="24"/>
         </w:rPr>
-        <w:t xml:space="preserve">The pilot therefore establishes feasibility: the harness, the classifier, and the analysis pipeline run on a language model and yield interpretable records. It does not test the hypotheses. It uses one 0.5-billion-parameter model, forced-choice action selection, two repetitions per cell, placeholder taxonomy scores, and no variation in model family, generation, or size. A null result at this scale is not evidence against LIDE in the larger instruction-tuned models the account concerns, and the direction of the loss effect should not be read as evidence for or against reflection.</w:t>
+        <w:t xml:space="preserve">The pilot therefore establishes feasibility: the harness, the classifier, and the analysis pipeline run on language models and yield interpretable records. It does not test the hypotheses. It uses two models below one billion parameters, one generation and one size per family, forced-choice action selection, two to four repetitions per cell with shared random draws, and placeholder taxonomy scores. Neither the absence of a loss effect nor the direction of the success contrast should be read as evidence for or against H1 to H5 in the larger instruction-tuned models the account concerns.</w:t>
       </w:r>
     </w:p>
     <w:p>
@@ -5663,7 +5784,7 @@
           <w:color w:val="000000"/>
           <w:sz w:val="24"/>
         </w:rPr>
-        <w:t>The central limitation is empirical absence. Hypotheses about LLM agents are untested. Motivating incidents and external studies used different models and tasks. The harness validation and the single small pilot in Section 4.6 cannot substitute for those tests.</w:t>
+        <w:t>The central limitation is empirical absence. Hypotheses about LLM agents are untested. Motivating incidents and external studies used different models and tasks. The harness validation and the small pilot in Section 4.6 cannot substitute for those tests.</w:t>
       </w:r>
     </w:p>
     <w:p>
@@ -5746,7 +5867,7 @@
           <w:color w:val="000000"/>
           <w:sz w:val="24"/>
         </w:rPr>
-        <w:t>What the paper delivers now is that account, a mapping onto three governance artifacts, and an instrument that separates known honest and escalating policies under length-matched histories, together with a feasibility pilot on one small open-weight model that found no LIDE but is too limited to bear on the hypotheses. What it does not deliver is evidence that current models exhibit LIDE or that the artifacts contain it. Those claims require the experiments specified in Section 4. Until they are run, the appropriate use of this manuscript is as a theory and design specification—not as a completed demonstration.</w:t>
+        <w:t>What the paper delivers now is that account, a mapping onto three governance artifacts, and an instrument that separates known honest and escalating policies under length-matched histories, together with a feasibility pilot on two small open-weight models that is too limited to bear on the hypotheses. What it does not deliver is evidence that current models exhibit LIDE or that the artifacts contain it. Those claims require the experiments specified in Section 4. Until they are run, the appropriate use of this manuscript is as a theory and design specification—not as a completed demonstration.</w:t>
       </w:r>
     </w:p>
     <w:p>

</xml_diff>